<commit_message>
Reorganize and document drug response project
</commit_message>
<xml_diff>
--- a/docs/Project_Diary.docx
+++ b/docs/Project_Diary.docx
@@ -1485,6 +1485,788 @@
       <w:pPr>
         <w:spacing w:after="0"/>
         <w:rPr>
+          <w:b/>
+          <w:bCs/>
+          <w:lang w:val="en-IL"/>
+        </w:rPr>
+      </w:pPr>
+      <w:r>
+        <w:rPr>
+          <w:b/>
+          <w:bCs/>
+          <w:lang w:val="en-IL"/>
+        </w:rPr>
+        <w:t xml:space="preserve">Day 5 – Drug-response </w:t>
+      </w:r>
+      <w:proofErr w:type="spellStart"/>
+      <w:r>
+        <w:rPr>
+          <w:b/>
+          <w:bCs/>
+          <w:lang w:val="en-IL"/>
+        </w:rPr>
+        <w:t>modeling</w:t>
+      </w:r>
+      <w:proofErr w:type="spellEnd"/>
+      <w:r>
+        <w:rPr>
+          <w:b/>
+          <w:bCs/>
+          <w:lang w:val="en-IL"/>
+        </w:rPr>
+        <w:t xml:space="preserve"> and multi-drug screening</w:t>
+      </w:r>
+    </w:p>
+    <w:p>
+      <w:pPr>
+        <w:spacing w:after="0"/>
+        <w:rPr>
+          <w:lang w:val="en-IL"/>
+        </w:rPr>
+      </w:pPr>
+      <w:r>
+        <w:rPr>
+          <w:lang w:val="en-IL"/>
+        </w:rPr>
+        <w:t xml:space="preserve">Continued development of the drug-response prediction pipeline using PRISM drug-response AUC and </w:t>
+      </w:r>
+      <w:proofErr w:type="spellStart"/>
+      <w:r>
+        <w:rPr>
+          <w:lang w:val="en-IL"/>
+        </w:rPr>
+        <w:t>DepMap</w:t>
+      </w:r>
+      <w:proofErr w:type="spellEnd"/>
+      <w:r>
+        <w:rPr>
+          <w:lang w:val="en-IL"/>
+        </w:rPr>
+        <w:t xml:space="preserve"> baseline RNA-seq expression.</w:t>
+      </w:r>
+    </w:p>
+    <w:p>
+      <w:pPr>
+        <w:numPr>
+          <w:ilvl w:val="0"/>
+          <w:numId w:val="6"/>
+        </w:numPr>
+        <w:spacing w:after="0"/>
+        <w:rPr>
+          <w:lang w:val="en-IL"/>
+        </w:rPr>
+      </w:pPr>
+      <w:r>
+        <w:rPr>
+          <w:lang w:val="en-IL"/>
+        </w:rPr>
+        <w:t xml:space="preserve">Finalized the </w:t>
+      </w:r>
+      <w:r>
+        <w:rPr>
+          <w:b/>
+          <w:bCs/>
+          <w:lang w:val="en-IL"/>
+        </w:rPr>
+        <w:t xml:space="preserve">AZD2014 </w:t>
+      </w:r>
+      <w:proofErr w:type="spellStart"/>
+      <w:r>
+        <w:rPr>
+          <w:b/>
+          <w:bCs/>
+          <w:lang w:val="en-IL"/>
+        </w:rPr>
+        <w:t>modeling</w:t>
+      </w:r>
+      <w:proofErr w:type="spellEnd"/>
+      <w:r>
+        <w:rPr>
+          <w:b/>
+          <w:bCs/>
+          <w:lang w:val="en-IL"/>
+        </w:rPr>
+        <w:t xml:space="preserve"> dataset</w:t>
+      </w:r>
+      <w:r>
+        <w:rPr>
+          <w:lang w:val="en-IL"/>
+        </w:rPr>
+        <w:t xml:space="preserve">: </w:t>
+      </w:r>
+    </w:p>
+    <w:p>
+      <w:pPr>
+        <w:numPr>
+          <w:ilvl w:val="1"/>
+          <w:numId w:val="6"/>
+        </w:numPr>
+        <w:spacing w:after="0"/>
+        <w:rPr>
+          <w:lang w:val="en-IL"/>
+        </w:rPr>
+      </w:pPr>
+      <w:r>
+        <w:rPr>
+          <w:lang w:val="en-IL"/>
+        </w:rPr>
+        <w:t xml:space="preserve">720 matched cell lines. </w:t>
+      </w:r>
+    </w:p>
+    <w:p>
+      <w:pPr>
+        <w:numPr>
+          <w:ilvl w:val="1"/>
+          <w:numId w:val="6"/>
+        </w:numPr>
+        <w:spacing w:after="0"/>
+        <w:rPr>
+          <w:lang w:val="en-IL"/>
+        </w:rPr>
+      </w:pPr>
+      <w:r>
+        <w:rPr>
+          <w:lang w:val="en-IL"/>
+        </w:rPr>
+        <w:t xml:space="preserve">19,206 expression features after removing 9 zero-variance genes. </w:t>
+      </w:r>
+    </w:p>
+    <w:p>
+      <w:pPr>
+        <w:numPr>
+          <w:ilvl w:val="1"/>
+          <w:numId w:val="6"/>
+        </w:numPr>
+        <w:spacing w:after="0"/>
+        <w:rPr>
+          <w:lang w:val="en-IL"/>
+        </w:rPr>
+      </w:pPr>
+      <w:r>
+        <w:rPr>
+          <w:lang w:val="en-IL"/>
+        </w:rPr>
+        <w:t xml:space="preserve">Used a 15% held-out test set and cross-validation within the training set. </w:t>
+      </w:r>
+    </w:p>
+    <w:p>
+      <w:pPr>
+        <w:numPr>
+          <w:ilvl w:val="0"/>
+          <w:numId w:val="6"/>
+        </w:numPr>
+        <w:spacing w:after="0"/>
+        <w:rPr>
+          <w:lang w:val="en-IL"/>
+        </w:rPr>
+      </w:pPr>
+      <w:r>
+        <w:rPr>
+          <w:lang w:val="en-IL"/>
+        </w:rPr>
+        <w:t xml:space="preserve">Evaluated several regression approaches on the full transcriptome: </w:t>
+      </w:r>
+    </w:p>
+    <w:p>
+      <w:pPr>
+        <w:numPr>
+          <w:ilvl w:val="1"/>
+          <w:numId w:val="6"/>
+        </w:numPr>
+        <w:spacing w:after="0"/>
+        <w:rPr>
+          <w:lang w:val="en-IL"/>
+        </w:rPr>
+      </w:pPr>
+      <w:r>
+        <w:rPr>
+          <w:b/>
+          <w:bCs/>
+          <w:lang w:val="en-IL"/>
+        </w:rPr>
+        <w:t>Elastic Net</w:t>
+      </w:r>
+      <w:r>
+        <w:rPr>
+          <w:lang w:val="en-IL"/>
+        </w:rPr>
+        <w:t xml:space="preserve"> </w:t>
+      </w:r>
+    </w:p>
+    <w:p>
+      <w:pPr>
+        <w:numPr>
+          <w:ilvl w:val="1"/>
+          <w:numId w:val="6"/>
+        </w:numPr>
+        <w:spacing w:after="0"/>
+        <w:rPr>
+          <w:lang w:val="en-IL"/>
+        </w:rPr>
+      </w:pPr>
+      <w:r>
+        <w:rPr>
+          <w:b/>
+          <w:bCs/>
+          <w:lang w:val="en-IL"/>
+        </w:rPr>
+        <w:t>RBF-SVR</w:t>
+      </w:r>
+      <w:r>
+        <w:rPr>
+          <w:lang w:val="en-IL"/>
+        </w:rPr>
+        <w:t xml:space="preserve"> </w:t>
+      </w:r>
+    </w:p>
+    <w:p>
+      <w:pPr>
+        <w:numPr>
+          <w:ilvl w:val="1"/>
+          <w:numId w:val="6"/>
+        </w:numPr>
+        <w:spacing w:after="0"/>
+        <w:rPr>
+          <w:lang w:val="en-IL"/>
+        </w:rPr>
+      </w:pPr>
+      <w:r>
+        <w:rPr>
+          <w:b/>
+          <w:bCs/>
+          <w:lang w:val="en-IL"/>
+        </w:rPr>
+        <w:t>Random Forest</w:t>
+      </w:r>
+      <w:r>
+        <w:rPr>
+          <w:lang w:val="en-IL"/>
+        </w:rPr>
+        <w:t xml:space="preserve"> </w:t>
+      </w:r>
+    </w:p>
+    <w:p>
+      <w:pPr>
+        <w:numPr>
+          <w:ilvl w:val="1"/>
+          <w:numId w:val="6"/>
+        </w:numPr>
+        <w:spacing w:after="0"/>
+        <w:rPr>
+          <w:lang w:val="en-IL"/>
+        </w:rPr>
+      </w:pPr>
+      <w:r>
+        <w:rPr>
+          <w:lang w:val="en-IL"/>
+        </w:rPr>
+        <w:t xml:space="preserve">Mean-response model as a baseline. </w:t>
+      </w:r>
+    </w:p>
+    <w:p>
+      <w:pPr>
+        <w:numPr>
+          <w:ilvl w:val="1"/>
+          <w:numId w:val="6"/>
+        </w:numPr>
+        <w:spacing w:after="0"/>
+        <w:rPr>
+          <w:lang w:val="en-IL"/>
+        </w:rPr>
+      </w:pPr>
+      <w:r>
+        <w:rPr>
+          <w:lang w:val="en-IL"/>
+        </w:rPr>
+        <w:t xml:space="preserve">All models showed weak test-set predictive performance for AZD2014. </w:t>
+      </w:r>
+    </w:p>
+    <w:p>
+      <w:pPr>
+        <w:numPr>
+          <w:ilvl w:val="1"/>
+          <w:numId w:val="6"/>
+        </w:numPr>
+        <w:spacing w:after="0"/>
+        <w:rPr>
+          <w:lang w:val="en-IL"/>
+        </w:rPr>
+      </w:pPr>
+      <w:r>
+        <w:rPr>
+          <w:lang w:val="en-IL"/>
+        </w:rPr>
+        <w:t xml:space="preserve">Random Forest and particularly flexible models showed evidence of substantial train/test overfitting. </w:t>
+      </w:r>
+    </w:p>
+    <w:p>
+      <w:pPr>
+        <w:numPr>
+          <w:ilvl w:val="0"/>
+          <w:numId w:val="6"/>
+        </w:numPr>
+        <w:spacing w:after="0"/>
+        <w:rPr>
+          <w:lang w:val="en-IL"/>
+        </w:rPr>
+      </w:pPr>
+      <w:r>
+        <w:rPr>
+          <w:lang w:val="en-IL"/>
+        </w:rPr>
+        <w:t xml:space="preserve">Explored </w:t>
+      </w:r>
+      <w:r>
+        <w:rPr>
+          <w:b/>
+          <w:bCs/>
+          <w:lang w:val="en-IL"/>
+        </w:rPr>
+        <w:t>PCA/PCR</w:t>
+      </w:r>
+      <w:r>
+        <w:rPr>
+          <w:lang w:val="en-IL"/>
+        </w:rPr>
+        <w:t xml:space="preserve"> as a possible dimensionality-reduction approach: </w:t>
+      </w:r>
+    </w:p>
+    <w:p>
+      <w:pPr>
+        <w:numPr>
+          <w:ilvl w:val="1"/>
+          <w:numId w:val="6"/>
+        </w:numPr>
+        <w:spacing w:after="0"/>
+        <w:rPr>
+          <w:lang w:val="en-IL"/>
+        </w:rPr>
+      </w:pPr>
+      <w:r>
+        <w:rPr>
+          <w:lang w:val="en-IL"/>
+        </w:rPr>
+        <w:t xml:space="preserve">Expression variance was spread across many principal components rather than concentrated in a small number. </w:t>
+      </w:r>
+    </w:p>
+    <w:p>
+      <w:pPr>
+        <w:numPr>
+          <w:ilvl w:val="1"/>
+          <w:numId w:val="6"/>
+        </w:numPr>
+        <w:spacing w:after="0"/>
+        <w:rPr>
+          <w:lang w:val="en-IL"/>
+        </w:rPr>
+      </w:pPr>
+      <w:r>
+        <w:rPr>
+          <w:lang w:val="en-IL"/>
+        </w:rPr>
+        <w:t xml:space="preserve">PC1 explained ~8.9% of expression variance and the first 10 PCs ~32%. </w:t>
+      </w:r>
+    </w:p>
+    <w:p>
+      <w:pPr>
+        <w:numPr>
+          <w:ilvl w:val="1"/>
+          <w:numId w:val="6"/>
+        </w:numPr>
+        <w:spacing w:after="0"/>
+        <w:rPr>
+          <w:lang w:val="en-IL"/>
+        </w:rPr>
+      </w:pPr>
+      <w:r>
+        <w:rPr>
+          <w:lang w:val="en-IL"/>
+        </w:rPr>
+        <w:t xml:space="preserve">Individual PCs showed only weak correlations with AZD2014 response. </w:t>
+      </w:r>
+    </w:p>
+    <w:p>
+      <w:pPr>
+        <w:numPr>
+          <w:ilvl w:val="1"/>
+          <w:numId w:val="6"/>
+        </w:numPr>
+        <w:spacing w:after="0"/>
+        <w:rPr>
+          <w:lang w:val="en-IL"/>
+        </w:rPr>
+      </w:pPr>
+      <w:r>
+        <w:rPr>
+          <w:lang w:val="en-IL"/>
+        </w:rPr>
+        <w:t xml:space="preserve">Discussed PCR and PLS as possible next approaches, noting that PLS may be particularly relevant because its components are constructed using information from the response variable. </w:t>
+      </w:r>
+    </w:p>
+    <w:p>
+      <w:pPr>
+        <w:numPr>
+          <w:ilvl w:val="0"/>
+          <w:numId w:val="6"/>
+        </w:numPr>
+        <w:spacing w:after="0"/>
+        <w:rPr>
+          <w:lang w:val="en-IL"/>
+        </w:rPr>
+      </w:pPr>
+      <w:r>
+        <w:rPr>
+          <w:lang w:val="en-IL"/>
+        </w:rPr>
+        <w:t xml:space="preserve">Developed a reusable </w:t>
+      </w:r>
+      <w:r>
+        <w:rPr>
+          <w:b/>
+          <w:bCs/>
+          <w:lang w:val="en-IL"/>
+        </w:rPr>
+        <w:t>drug_screening.py</w:t>
+      </w:r>
+      <w:r>
+        <w:rPr>
+          <w:lang w:val="en-IL"/>
+        </w:rPr>
+        <w:t xml:space="preserve"> pipeline: </w:t>
+      </w:r>
+    </w:p>
+    <w:p>
+      <w:pPr>
+        <w:numPr>
+          <w:ilvl w:val="1"/>
+          <w:numId w:val="6"/>
+        </w:numPr>
+        <w:spacing w:after="0"/>
+        <w:rPr>
+          <w:lang w:val="en-IL"/>
+        </w:rPr>
+      </w:pPr>
+      <w:r>
+        <w:rPr>
+          <w:lang w:val="en-IL"/>
+        </w:rPr>
+        <w:t xml:space="preserve">Automatically selects and preprocesses a requested PRISM drug. </w:t>
+      </w:r>
+    </w:p>
+    <w:p>
+      <w:pPr>
+        <w:numPr>
+          <w:ilvl w:val="1"/>
+          <w:numId w:val="6"/>
+        </w:numPr>
+        <w:spacing w:after="0"/>
+        <w:rPr>
+          <w:lang w:val="en-IL"/>
+        </w:rPr>
+      </w:pPr>
+      <w:r>
+        <w:rPr>
+          <w:lang w:val="en-IL"/>
+        </w:rPr>
+        <w:t xml:space="preserve">Resolves repeated PRISM measurements using the established MTS010/PR500 → MTS010/PR300 → HTS002/PR500 priority. </w:t>
+      </w:r>
+    </w:p>
+    <w:p>
+      <w:pPr>
+        <w:numPr>
+          <w:ilvl w:val="1"/>
+          <w:numId w:val="6"/>
+        </w:numPr>
+        <w:spacing w:after="0"/>
+        <w:rPr>
+          <w:lang w:val="en-IL"/>
+        </w:rPr>
+      </w:pPr>
+      <w:r>
+        <w:rPr>
+          <w:lang w:val="en-IL"/>
+        </w:rPr>
+        <w:t xml:space="preserve">Matches response measurements with default RNA-seq profiles. </w:t>
+      </w:r>
+    </w:p>
+    <w:p>
+      <w:pPr>
+        <w:numPr>
+          <w:ilvl w:val="1"/>
+          <w:numId w:val="6"/>
+        </w:numPr>
+        <w:spacing w:after="0"/>
+        <w:rPr>
+          <w:lang w:val="en-IL"/>
+        </w:rPr>
+      </w:pPr>
+      <w:r>
+        <w:rPr>
+          <w:lang w:val="en-IL"/>
+        </w:rPr>
+        <w:t xml:space="preserve">Removes metadata and zero-variance genes. </w:t>
+      </w:r>
+    </w:p>
+    <w:p>
+      <w:pPr>
+        <w:numPr>
+          <w:ilvl w:val="1"/>
+          <w:numId w:val="6"/>
+        </w:numPr>
+        <w:spacing w:after="0"/>
+        <w:rPr>
+          <w:lang w:val="en-IL"/>
+        </w:rPr>
+      </w:pPr>
+      <w:r>
+        <w:rPr>
+          <w:lang w:val="en-IL"/>
+        </w:rPr>
+        <w:t xml:space="preserve">Runs selected regression models with cross-validated hyperparameter tuning. </w:t>
+      </w:r>
+    </w:p>
+    <w:p>
+      <w:pPr>
+        <w:numPr>
+          <w:ilvl w:val="1"/>
+          <w:numId w:val="6"/>
+        </w:numPr>
+        <w:spacing w:after="0"/>
+        <w:rPr>
+          <w:lang w:val="en-IL"/>
+        </w:rPr>
+      </w:pPr>
+      <w:r>
+        <w:rPr>
+          <w:lang w:val="en-IL"/>
+        </w:rPr>
+        <w:t xml:space="preserve">Compares performance against a mean-only baseline. </w:t>
+      </w:r>
+    </w:p>
+    <w:p>
+      <w:pPr>
+        <w:numPr>
+          <w:ilvl w:val="1"/>
+          <w:numId w:val="6"/>
+        </w:numPr>
+        <w:spacing w:after="0"/>
+        <w:rPr>
+          <w:lang w:val="en-IL"/>
+        </w:rPr>
+      </w:pPr>
+      <w:r>
+        <w:rPr>
+          <w:lang w:val="en-IL"/>
+        </w:rPr>
+        <w:t xml:space="preserve">Calculates MAE, RMSE, R², CV RMSE, train R², and improvement over baseline. </w:t>
+      </w:r>
+    </w:p>
+    <w:p>
+      <w:pPr>
+        <w:numPr>
+          <w:ilvl w:val="1"/>
+          <w:numId w:val="6"/>
+        </w:numPr>
+        <w:spacing w:after="0"/>
+        <w:rPr>
+          <w:lang w:val="en-IL"/>
+        </w:rPr>
+      </w:pPr>
+      <w:r>
+        <w:rPr>
+          <w:lang w:val="en-IL"/>
+        </w:rPr>
+        <w:lastRenderedPageBreak/>
+        <w:t xml:space="preserve">Automatically saves data summaries, predictions, model results, and diagnostic plots in a separate folder for each drug. </w:t>
+      </w:r>
+    </w:p>
+    <w:p>
+      <w:pPr>
+        <w:numPr>
+          <w:ilvl w:val="0"/>
+          <w:numId w:val="6"/>
+        </w:numPr>
+        <w:spacing w:after="0"/>
+        <w:rPr>
+          <w:lang w:val="en-IL"/>
+        </w:rPr>
+      </w:pPr>
+      <w:r>
+        <w:rPr>
+          <w:lang w:val="en-IL"/>
+        </w:rPr>
+        <w:t xml:space="preserve">Created </w:t>
+      </w:r>
+      <w:r>
+        <w:rPr>
+          <w:b/>
+          <w:bCs/>
+          <w:lang w:val="en-IL"/>
+        </w:rPr>
+        <w:t>drug_search.py</w:t>
+      </w:r>
+      <w:r>
+        <w:rPr>
+          <w:lang w:val="en-IL"/>
+        </w:rPr>
+        <w:t xml:space="preserve"> to rapidly screen multiple drugs with high RNA-seq/PRISM overlap using the same standardized </w:t>
+      </w:r>
+      <w:proofErr w:type="spellStart"/>
+      <w:r>
+        <w:rPr>
+          <w:lang w:val="en-IL"/>
+        </w:rPr>
+        <w:t>modeling</w:t>
+      </w:r>
+      <w:proofErr w:type="spellEnd"/>
+      <w:r>
+        <w:rPr>
+          <w:lang w:val="en-IL"/>
+        </w:rPr>
+        <w:t xml:space="preserve"> procedure. </w:t>
+      </w:r>
+    </w:p>
+    <w:p>
+      <w:pPr>
+        <w:numPr>
+          <w:ilvl w:val="0"/>
+          <w:numId w:val="6"/>
+        </w:numPr>
+        <w:spacing w:after="0"/>
+        <w:rPr>
+          <w:lang w:val="en-IL"/>
+        </w:rPr>
+      </w:pPr>
+      <w:r>
+        <w:rPr>
+          <w:lang w:val="en-IL"/>
+        </w:rPr>
+        <w:t xml:space="preserve">Screened approximately </w:t>
+      </w:r>
+      <w:r>
+        <w:rPr>
+          <w:b/>
+          <w:bCs/>
+          <w:lang w:val="en-IL"/>
+        </w:rPr>
+        <w:t>10 highly covered drugs</w:t>
+      </w:r>
+      <w:r>
+        <w:rPr>
+          <w:lang w:val="en-IL"/>
+        </w:rPr>
+        <w:t xml:space="preserve">. </w:t>
+      </w:r>
+    </w:p>
+    <w:p>
+      <w:pPr>
+        <w:numPr>
+          <w:ilvl w:val="1"/>
+          <w:numId w:val="6"/>
+        </w:numPr>
+        <w:spacing w:after="0"/>
+        <w:rPr>
+          <w:lang w:val="en-IL"/>
+        </w:rPr>
+      </w:pPr>
+      <w:r>
+        <w:rPr>
+          <w:lang w:val="en-IL"/>
+        </w:rPr>
+        <w:t xml:space="preserve">Results were broadly similar across drugs: generally low out-of-sample R² and relatively small improvements over the mean baseline. </w:t>
+      </w:r>
+    </w:p>
+    <w:p>
+      <w:pPr>
+        <w:numPr>
+          <w:ilvl w:val="1"/>
+          <w:numId w:val="6"/>
+        </w:numPr>
+        <w:spacing w:after="0"/>
+        <w:rPr>
+          <w:lang w:val="en-IL"/>
+        </w:rPr>
+      </w:pPr>
+      <w:r>
+        <w:rPr>
+          <w:lang w:val="en-IL"/>
+        </w:rPr>
+        <w:t xml:space="preserve">Example: </w:t>
+      </w:r>
+      <w:proofErr w:type="spellStart"/>
+      <w:r>
+        <w:rPr>
+          <w:lang w:val="en-IL"/>
+        </w:rPr>
+        <w:t>teniposide</w:t>
+      </w:r>
+      <w:proofErr w:type="spellEnd"/>
+      <w:r>
+        <w:rPr>
+          <w:lang w:val="en-IL"/>
+        </w:rPr>
+        <w:t xml:space="preserve"> had 714 matched cell lines. Elastic Net achieved test R² ≈ 0.13 and ~6.7% RMSE improvement over the mean baseline, while SVR achieved train R² ≈ 1 but test R² ≈ 0.09, indicating severe overfitting. </w:t>
+      </w:r>
+    </w:p>
+    <w:p>
+      <w:pPr>
+        <w:numPr>
+          <w:ilvl w:val="1"/>
+          <w:numId w:val="6"/>
+        </w:numPr>
+        <w:spacing w:after="0"/>
+        <w:rPr>
+          <w:lang w:val="en-IL"/>
+        </w:rPr>
+      </w:pPr>
+      <w:r>
+        <w:rPr>
+          <w:lang w:val="en-IL"/>
+        </w:rPr>
+        <w:t xml:space="preserve">Therefore, the weak AZD2014 result does not appear to be explained simply by choosing an unusually difficult drug. </w:t>
+      </w:r>
+    </w:p>
+    <w:p>
+      <w:pPr>
+        <w:spacing w:after="0"/>
+        <w:rPr>
+          <w:lang w:val="en-IL"/>
+        </w:rPr>
+      </w:pPr>
+      <w:r>
+        <w:rPr>
+          <w:b/>
+          <w:bCs/>
+          <w:lang w:val="en-IL"/>
+        </w:rPr>
+        <w:t>Main conclusion:</w:t>
+      </w:r>
+      <w:r>
+        <w:rPr>
+          <w:lang w:val="en-IL"/>
+        </w:rPr>
+        <w:br/>
+        <w:t xml:space="preserve">Direct prediction of PRISM drug-response AUC from the complete ~19,000-gene baseline expression matrix shows limited generalization across multiple tested drugs. Rather than continuing to screen many additional drugs or simply trying more algorithms, the next stage will investigate whether the predictive signal can be improved through </w:t>
+      </w:r>
+      <w:r>
+        <w:rPr>
+          <w:b/>
+          <w:bCs/>
+          <w:lang w:val="en-IL"/>
+        </w:rPr>
+        <w:t>dimensionality reduction, supervised feature extraction/selection, pathway-level representations, and potentially cancer-lineage information</w:t>
+      </w:r>
+      <w:r>
+        <w:rPr>
+          <w:lang w:val="en-IL"/>
+        </w:rPr>
+        <w:t>.</w:t>
+      </w:r>
+    </w:p>
+    <w:p>
+      <w:pPr>
+        <w:spacing w:after="0"/>
+        <w:rPr>
           <w:lang w:val="en-IL"/>
         </w:rPr>
       </w:pPr>
@@ -1667,6 +2449,155 @@
     </w:lvl>
   </w:abstractNum>
   <w:abstractNum w:abstractNumId="1" w15:restartNumberingAfterBreak="0">
+    <w:nsid w:val="159D5C93"/>
+    <w:multiLevelType w:val="multilevel"/>
+    <w:tmpl w:val="6F7C4EEC"/>
+    <w:lvl w:ilvl="0">
+      <w:start w:val="1"/>
+      <w:numFmt w:val="bullet"/>
+      <w:lvlText w:val=""/>
+      <w:lvlJc w:val="left"/>
+      <w:pPr>
+        <w:tabs>
+          <w:tab w:val="num" w:pos="720"/>
+        </w:tabs>
+        <w:ind w:left="720" w:hanging="360"/>
+      </w:pPr>
+      <w:rPr>
+        <w:rFonts w:ascii="Symbol" w:hAnsi="Symbol" w:hint="default"/>
+        <w:sz w:val="20"/>
+      </w:rPr>
+    </w:lvl>
+    <w:lvl w:ilvl="1">
+      <w:start w:val="1"/>
+      <w:numFmt w:val="bullet"/>
+      <w:lvlText w:val="o"/>
+      <w:lvlJc w:val="left"/>
+      <w:pPr>
+        <w:tabs>
+          <w:tab w:val="num" w:pos="1440"/>
+        </w:tabs>
+        <w:ind w:left="1440" w:hanging="360"/>
+      </w:pPr>
+      <w:rPr>
+        <w:rFonts w:ascii="Courier New" w:hAnsi="Courier New" w:hint="default"/>
+        <w:sz w:val="20"/>
+      </w:rPr>
+    </w:lvl>
+    <w:lvl w:ilvl="2" w:tentative="1">
+      <w:start w:val="1"/>
+      <w:numFmt w:val="bullet"/>
+      <w:lvlText w:val=""/>
+      <w:lvlJc w:val="left"/>
+      <w:pPr>
+        <w:tabs>
+          <w:tab w:val="num" w:pos="2160"/>
+        </w:tabs>
+        <w:ind w:left="2160" w:hanging="360"/>
+      </w:pPr>
+      <w:rPr>
+        <w:rFonts w:ascii="Wingdings" w:hAnsi="Wingdings" w:hint="default"/>
+        <w:sz w:val="20"/>
+      </w:rPr>
+    </w:lvl>
+    <w:lvl w:ilvl="3" w:tentative="1">
+      <w:start w:val="1"/>
+      <w:numFmt w:val="bullet"/>
+      <w:lvlText w:val=""/>
+      <w:lvlJc w:val="left"/>
+      <w:pPr>
+        <w:tabs>
+          <w:tab w:val="num" w:pos="2880"/>
+        </w:tabs>
+        <w:ind w:left="2880" w:hanging="360"/>
+      </w:pPr>
+      <w:rPr>
+        <w:rFonts w:ascii="Wingdings" w:hAnsi="Wingdings" w:hint="default"/>
+        <w:sz w:val="20"/>
+      </w:rPr>
+    </w:lvl>
+    <w:lvl w:ilvl="4" w:tentative="1">
+      <w:start w:val="1"/>
+      <w:numFmt w:val="bullet"/>
+      <w:lvlText w:val=""/>
+      <w:lvlJc w:val="left"/>
+      <w:pPr>
+        <w:tabs>
+          <w:tab w:val="num" w:pos="3600"/>
+        </w:tabs>
+        <w:ind w:left="3600" w:hanging="360"/>
+      </w:pPr>
+      <w:rPr>
+        <w:rFonts w:ascii="Wingdings" w:hAnsi="Wingdings" w:hint="default"/>
+        <w:sz w:val="20"/>
+      </w:rPr>
+    </w:lvl>
+    <w:lvl w:ilvl="5" w:tentative="1">
+      <w:start w:val="1"/>
+      <w:numFmt w:val="bullet"/>
+      <w:lvlText w:val=""/>
+      <w:lvlJc w:val="left"/>
+      <w:pPr>
+        <w:tabs>
+          <w:tab w:val="num" w:pos="4320"/>
+        </w:tabs>
+        <w:ind w:left="4320" w:hanging="360"/>
+      </w:pPr>
+      <w:rPr>
+        <w:rFonts w:ascii="Wingdings" w:hAnsi="Wingdings" w:hint="default"/>
+        <w:sz w:val="20"/>
+      </w:rPr>
+    </w:lvl>
+    <w:lvl w:ilvl="6" w:tentative="1">
+      <w:start w:val="1"/>
+      <w:numFmt w:val="bullet"/>
+      <w:lvlText w:val=""/>
+      <w:lvlJc w:val="left"/>
+      <w:pPr>
+        <w:tabs>
+          <w:tab w:val="num" w:pos="5040"/>
+        </w:tabs>
+        <w:ind w:left="5040" w:hanging="360"/>
+      </w:pPr>
+      <w:rPr>
+        <w:rFonts w:ascii="Wingdings" w:hAnsi="Wingdings" w:hint="default"/>
+        <w:sz w:val="20"/>
+      </w:rPr>
+    </w:lvl>
+    <w:lvl w:ilvl="7" w:tentative="1">
+      <w:start w:val="1"/>
+      <w:numFmt w:val="bullet"/>
+      <w:lvlText w:val=""/>
+      <w:lvlJc w:val="left"/>
+      <w:pPr>
+        <w:tabs>
+          <w:tab w:val="num" w:pos="5760"/>
+        </w:tabs>
+        <w:ind w:left="5760" w:hanging="360"/>
+      </w:pPr>
+      <w:rPr>
+        <w:rFonts w:ascii="Wingdings" w:hAnsi="Wingdings" w:hint="default"/>
+        <w:sz w:val="20"/>
+      </w:rPr>
+    </w:lvl>
+    <w:lvl w:ilvl="8" w:tentative="1">
+      <w:start w:val="1"/>
+      <w:numFmt w:val="bullet"/>
+      <w:lvlText w:val=""/>
+      <w:lvlJc w:val="left"/>
+      <w:pPr>
+        <w:tabs>
+          <w:tab w:val="num" w:pos="6480"/>
+        </w:tabs>
+        <w:ind w:left="6480" w:hanging="360"/>
+      </w:pPr>
+      <w:rPr>
+        <w:rFonts w:ascii="Wingdings" w:hAnsi="Wingdings" w:hint="default"/>
+        <w:sz w:val="20"/>
+      </w:rPr>
+    </w:lvl>
+  </w:abstractNum>
+  <w:abstractNum w:abstractNumId="2" w15:restartNumberingAfterBreak="0">
     <w:nsid w:val="1BFA07AB"/>
     <w:multiLevelType w:val="multilevel"/>
     <w:tmpl w:val="D870F87A"/>
@@ -1815,7 +2746,7 @@
       </w:rPr>
     </w:lvl>
   </w:abstractNum>
-  <w:abstractNum w:abstractNumId="2" w15:restartNumberingAfterBreak="0">
+  <w:abstractNum w:abstractNumId="3" w15:restartNumberingAfterBreak="0">
     <w:nsid w:val="30364BCE"/>
     <w:multiLevelType w:val="multilevel"/>
     <w:tmpl w:val="AFF4D6F6"/>
@@ -1964,7 +2895,7 @@
       </w:rPr>
     </w:lvl>
   </w:abstractNum>
-  <w:abstractNum w:abstractNumId="3" w15:restartNumberingAfterBreak="0">
+  <w:abstractNum w:abstractNumId="4" w15:restartNumberingAfterBreak="0">
     <w:nsid w:val="60F307F6"/>
     <w:multiLevelType w:val="multilevel"/>
     <w:tmpl w:val="19B8FBC0"/>
@@ -2113,7 +3044,7 @@
       </w:rPr>
     </w:lvl>
   </w:abstractNum>
-  <w:abstractNum w:abstractNumId="4" w15:restartNumberingAfterBreak="0">
+  <w:abstractNum w:abstractNumId="5" w15:restartNumberingAfterBreak="0">
     <w:nsid w:val="653D2102"/>
     <w:multiLevelType w:val="multilevel"/>
     <w:tmpl w:val="1FBE252E"/>
@@ -2263,18 +3194,21 @@
     </w:lvl>
   </w:abstractNum>
   <w:num w:numId="1" w16cid:durableId="1516458123">
-    <w:abstractNumId w:val="4"/>
+    <w:abstractNumId w:val="5"/>
   </w:num>
   <w:num w:numId="2" w16cid:durableId="638808306">
-    <w:abstractNumId w:val="2"/>
+    <w:abstractNumId w:val="3"/>
   </w:num>
   <w:num w:numId="3" w16cid:durableId="1139155501">
-    <w:abstractNumId w:val="3"/>
+    <w:abstractNumId w:val="4"/>
   </w:num>
   <w:num w:numId="4" w16cid:durableId="41489244">
     <w:abstractNumId w:val="0"/>
   </w:num>
   <w:num w:numId="5" w16cid:durableId="1905990519">
+    <w:abstractNumId w:val="2"/>
+  </w:num>
+  <w:num w:numId="6" w16cid:durableId="52313550">
     <w:abstractNumId w:val="1"/>
   </w:num>
 </w:numbering>

</xml_diff>